<commit_message>
Refactor clean_docx.py for heuristic paragraph style inference
- Introduced new functions to infer and assign InDesign paragraph styles based on heuristics for body text, table captions, and footnotes.
- Added mechanisms to register custom styles in the document's styles.xml to ensure compatibility with InDesign.
- Enhanced the handling of paragraph formatting, including bold, italic, and font size detection for improved style assignment.
- Removed extract_tables.py as it is no longer needed for the current processing workflow.
- Updated binary documents to reflect changes in footnote handling and document structure.
</commit_message>
<xml_diff>
--- a/docs/Cry1Ab_FFS_original_clean.docx
+++ b/docs/Cry1Ab_FFS_original_clean.docx
@@ -569,6 +569,7 @@
     </w:p>
     <w:p>
       <w:pPr>
+        <w:pStyle w:val="Head_SubsectionUnnumbered"/>
         <w:spacing w:before="240" w:after="240"/>
       </w:pPr>
       <w:r>
@@ -1309,6 +1310,9 @@
       </w:r>
     </w:p>
     <w:p>
+      <w:pPr>
+        <w:pStyle w:val="Table_Header"/>
+      </w:pPr>
       <w:r>
         <w:t>Table 1. Cry1Ab expressing maize single transformation events with food safety approvals up to 2010.</w:t>
       </w:r>
@@ -4815,7 +4819,9 @@
       <w:pPr/>
     </w:p>
     <w:p>
-      <w:pPr/>
+      <w:pPr>
+        <w:pStyle w:val="Table_Header"/>
+      </w:pPr>
       <w:r>
         <w:rPr/>
         <w:t xml:space="preserve">Table 2. Cry1Ab </w:t>
@@ -6363,6 +6369,9 @@
       <w:pPr/>
     </w:p>
     <w:p>
+      <w:pPr>
+        <w:pStyle w:val="Table_Header"/>
+      </w:pPr>
       <w:r>
         <w:t>Table 3. Cry1Ab expressing maize event MON810 breeding stacks with food safety approvals. Approvals after 2020 are highlighted.</w:t>
       </w:r>
@@ -14582,14 +14591,18 @@
       </w:tr>
     </w:tbl>
     <w:p>
-      <w:pPr/>
+      <w:pPr>
+        <w:pStyle w:val="Table_FootNote"/>
+      </w:pPr>
       <w:r>
         <w:rPr/>
         <w:t>*Pakistan has also approved NK603 x MON810. This is the only stack with MON810 with food safety approval in this country.</w:t>
       </w:r>
     </w:p>
     <w:p>
-      <w:pPr/>
+      <w:pPr>
+        <w:pStyle w:val="Table_FootNote"/>
+      </w:pPr>
       <w:r>
         <w:rPr/>
         <w:t>**Iran has approved TC1507 x MON810**.  This is the only stack with MON810 with food safety approval in this country.</w:t>
@@ -14602,6 +14615,9 @@
       <w:pPr/>
     </w:p>
     <w:p>
+      <w:pPr>
+        <w:pStyle w:val="Table_Header"/>
+      </w:pPr>
       <w:r>
         <w:t>Table 4. Cry1Ab expressing maize event Bt11 breeding stacks with food safety approvals. Approvals after 2020 are highlighted.</w:t>
       </w:r>
@@ -25788,7 +25804,9 @@
       </w:tr>
     </w:tbl>
     <w:p>
-      <w:pPr/>
+      <w:pPr>
+        <w:pStyle w:val="Table_FootNote"/>
+      </w:pPr>
       <w:r>
         <w:rPr/>
         <w:lastRenderedPageBreak/>
@@ -25796,7 +25814,9 @@
       </w:r>
     </w:p>
     <w:p>
-      <w:pPr/>
+      <w:pPr>
+        <w:pStyle w:val="Table_FootNote"/>
+      </w:pPr>
       <w:r>
         <w:rPr/>
         <w:t>**Canada has also approved BT11 x MIR162 x MIR604 x MON89034 x 5307 x GA21.  This is the only stack with Bt11 with food safety approval in this country.</w:t>
@@ -25964,7 +25984,9 @@
       <w:pPr/>
     </w:p>
     <w:p>
-      <w:pPr/>
+      <w:pPr>
+        <w:pStyle w:val="Table_Header"/>
+      </w:pPr>
       <w:r>
         <w:rPr/>
         <w:t xml:space="preserve">Table 5. Cry1Ab expressing cotton, cowpea, eucalyptus, rice, sugarcane </w:t>
@@ -31021,6 +31043,7 @@
     </w:p>
     <w:p>
       <w:pPr>
+        <w:pStyle w:val="Table_Header"/>
         <w:spacing w:line="276" w:lineRule="auto"/>
       </w:pPr>
       <w:r>
@@ -31879,7 +31902,7 @@
     </w:p>
     <w:p>
       <w:pPr>
-        <w:pStyle w:val="BodyText"/>
+        <w:pStyle w:val="Head_SubsectionUnnumbered"/>
         <w:spacing w:after="0"/>
       </w:pPr>
       <w:r>
@@ -33597,7 +33620,7 @@
     </w:p>
     <w:p>
       <w:pPr>
-        <w:pStyle w:val="BodyText"/>
+        <w:pStyle w:val="Table_Header"/>
         <w:spacing w:before="240" w:after="240"/>
       </w:pPr>
       <w:r>
@@ -35475,7 +35498,7 @@
     </w:p>
     <w:p>
       <w:pPr>
-        <w:pStyle w:val="BodyText"/>
+        <w:pStyle w:val="Table_Header"/>
         <w:spacing w:before="177" w:line="249" w:lineRule="auto"/>
         <w:jc w:val="both"/>
       </w:pPr>
@@ -38189,7 +38212,9 @@
       <w:pPr/>
     </w:p>
     <w:p>
-      <w:pPr/>
+      <w:pPr>
+        <w:pStyle w:val="Table_FootNote"/>
+      </w:pPr>
       <w:r>
         <w:rPr>
           <w:i/>
@@ -38200,7 +38225,9 @@
       </w:r>
     </w:p>
     <w:p>
-      <w:pPr/>
+      <w:pPr>
+        <w:pStyle w:val="Table_FootNote"/>
+      </w:pPr>
       <w:r>
         <w:rPr>
           <w:i/>
@@ -39013,6 +39040,7 @@
     </w:p>
     <w:p>
       <w:pPr>
+        <w:pStyle w:val="Head_SubsectionUnnumbered"/>
         <w:spacing w:before="120" w:after="120" w:line="276" w:lineRule="auto"/>
       </w:pPr>
       <w:r>
@@ -39254,6 +39282,7 @@
     </w:p>
     <w:p>
       <w:pPr>
+        <w:pStyle w:val="Head_SubsectionUnnumbered"/>
         <w:spacing w:before="240" w:after="240" w:line="276" w:lineRule="auto"/>
       </w:pPr>
       <w:r>
@@ -39897,7 +39926,7 @@
     </w:p>
     <w:p>
       <w:pPr>
-        <w:pStyle w:val="BodyText"/>
+        <w:pStyle w:val="Head_SubsectionUnnumbered"/>
         <w:spacing w:before="240" w:after="240" w:line="276" w:lineRule="auto"/>
       </w:pPr>
       <w:r>
@@ -40206,6 +40235,27 @@
       <w:r>
         <w:rPr/>
         <w:t>(See Table 6.)</w:t>
+      </w:r>
+    </w:p>
+    <w:p>
+      <w:pPr>
+        <w:autoSpaceDE w:val="0"/>
+        <w:autoSpaceDN w:val="0"/>
+        <w:adjustRightInd w:val="0"/>
+        <w:spacing w:line="276" w:lineRule="auto"/>
+      </w:pPr>
+    </w:p>
+    <w:p>
+      <w:pPr>
+        <w:pStyle w:val="Head_SubsectionUnnumbered"/>
+        <w:autoSpaceDE w:val="0"/>
+        <w:autoSpaceDN w:val="0"/>
+        <w:adjustRightInd w:val="0"/>
+        <w:spacing w:line="276" w:lineRule="auto"/>
+      </w:pPr>
+      <w:r>
+        <w:rPr/>
+        <w:t>Digestibility studies on Cry1Ab protein</w:t>
       </w:r>
     </w:p>
     <w:p>
@@ -40225,7 +40275,124 @@
       </w:pPr>
       <w:r>
         <w:rPr/>
-        <w:t>Digestibility studies on Cry1Ab protein</w:t>
+        <w:t>Rapid digestibility studies are also used to test for allergenicity, as well as toxicity, of</w:t>
+      </w:r>
+      <w:r>
+        <w:rPr/>
+        <w:t xml:space="preserve"> </w:t>
+      </w:r>
+      <w:r>
+        <w:rPr/>
+        <w:t>newly expressed proteins in GE plants</w:t>
+      </w:r>
+      <w:r>
+        <w:rPr/>
+        <w:t xml:space="preserve">, usually through a </w:t>
+      </w:r>
+      <w:r>
+        <w:rPr/>
+        <w:t>simulated (</w:t>
+      </w:r>
+      <w:r>
+        <w:rPr/>
+        <w:t>m</w:t>
+      </w:r>
+      <w:r>
+        <w:rPr/>
+        <w:t xml:space="preserve">ammalian) gastric fluid </w:t>
+      </w:r>
+      <w:r>
+        <w:rPr/>
+        <w:t>assay</w:t>
+      </w:r>
+      <w:r>
+        <w:rPr/>
+        <w:t xml:space="preserve"> </w:t>
+      </w:r>
+      <w:r>
+        <w:rPr/>
+        <w:t>(Delaney et al., 2008</w:t>
+      </w:r>
+      <w:r>
+        <w:rPr/>
+        <w:t>)</w:t>
+      </w:r>
+      <w:r>
+        <w:rPr/>
+        <w:t xml:space="preserve">.  </w:t>
+      </w:r>
+      <w:r>
+        <w:rPr/>
+        <w:t>Rapid</w:t>
+      </w:r>
+      <w:r>
+        <w:rPr/>
+        <w:t xml:space="preserve">ly digestible proteins, like </w:t>
+      </w:r>
+      <w:r>
+        <w:rPr/>
+        <w:t>most</w:t>
+      </w:r>
+      <w:r>
+        <w:rPr/>
+        <w:t xml:space="preserve"> food proteins, are unlikely to result in allergic or toxic reactions</w:t>
+      </w:r>
+      <w:r>
+        <w:rPr/>
+        <w:t xml:space="preserve">. </w:t>
+      </w:r>
+      <w:r>
+        <w:rPr/>
+        <w:t>Digestibility studies are an expected test for safety of newly expressed proteins in GE crops, although s</w:t>
+      </w:r>
+      <w:r>
+        <w:rPr/>
+        <w:t xml:space="preserve">ome studies have concluded </w:t>
+      </w:r>
+      <w:r>
+        <w:rPr/>
+        <w:lastRenderedPageBreak/>
+        <w:t>that stability to digestion and allergenicity are not related (</w:t>
+      </w:r>
+      <w:r>
+        <w:rPr/>
+        <w:t>Fu et al., 2002; Herman et al.,</w:t>
+      </w:r>
+      <w:r>
+        <w:rPr/>
+        <w:t xml:space="preserve"> </w:t>
+      </w:r>
+      <w:r>
+        <w:rPr/>
+        <w:t>2007; Bogh and Madsen, 2015)</w:t>
+      </w:r>
+      <w:r>
+        <w:rPr/>
+        <w:t>, and allergenicity and toxicity assessment based on history of safe use, mode of action and bioinformatics, without digestibility studies</w:t>
+      </w:r>
+      <w:r>
+        <w:rPr/>
+        <w:t>,</w:t>
+      </w:r>
+      <w:r>
+        <w:rPr/>
+        <w:t xml:space="preserve"> may be sufficient to demonstrate safety of newly expressed proteins in GE crops (Brune et al</w:t>
+      </w:r>
+      <w:r>
+        <w:rPr/>
+        <w:t xml:space="preserve">. </w:t>
+      </w:r>
+      <w:r>
+        <w:rPr/>
+        <w:t>2021)</w:t>
+      </w:r>
+      <w:r>
+        <w:rPr/>
+        <w:t>.</w:t>
+      </w:r>
+      <w:r>
+        <w:rPr/>
+        <w:t xml:space="preserve"> </w:t>
       </w:r>
     </w:p>
     <w:p>
@@ -40245,143 +40412,6 @@
       </w:pPr>
       <w:r>
         <w:rPr/>
-        <w:t>Rapid digestibility studies are also used to test for allergenicity, as well as toxicity, of</w:t>
-      </w:r>
-      <w:r>
-        <w:rPr/>
-        <w:t xml:space="preserve"> </w:t>
-      </w:r>
-      <w:r>
-        <w:rPr/>
-        <w:t>newly expressed proteins in GE plants</w:t>
-      </w:r>
-      <w:r>
-        <w:rPr/>
-        <w:t xml:space="preserve">, usually through a </w:t>
-      </w:r>
-      <w:r>
-        <w:rPr/>
-        <w:t>simulated (</w:t>
-      </w:r>
-      <w:r>
-        <w:rPr/>
-        <w:t>m</w:t>
-      </w:r>
-      <w:r>
-        <w:rPr/>
-        <w:t xml:space="preserve">ammalian) gastric fluid </w:t>
-      </w:r>
-      <w:r>
-        <w:rPr/>
-        <w:t>assay</w:t>
-      </w:r>
-      <w:r>
-        <w:rPr/>
-        <w:t xml:space="preserve"> </w:t>
-      </w:r>
-      <w:r>
-        <w:rPr/>
-        <w:t>(Delaney et al., 2008</w:t>
-      </w:r>
-      <w:r>
-        <w:rPr/>
-        <w:t>)</w:t>
-      </w:r>
-      <w:r>
-        <w:rPr/>
-        <w:t xml:space="preserve">.  </w:t>
-      </w:r>
-      <w:r>
-        <w:rPr/>
-        <w:t>Rapid</w:t>
-      </w:r>
-      <w:r>
-        <w:rPr/>
-        <w:t xml:space="preserve">ly digestible proteins, like </w:t>
-      </w:r>
-      <w:r>
-        <w:rPr/>
-        <w:t>most</w:t>
-      </w:r>
-      <w:r>
-        <w:rPr/>
-        <w:t xml:space="preserve"> food proteins, are unlikely to result in allergic or toxic reactions</w:t>
-      </w:r>
-      <w:r>
-        <w:rPr/>
-        <w:t xml:space="preserve">. </w:t>
-      </w:r>
-      <w:r>
-        <w:rPr/>
-        <w:t>Digestibility studies are an expected test for safety of newly expressed proteins in GE crops, although s</w:t>
-      </w:r>
-      <w:r>
-        <w:rPr/>
-        <w:t xml:space="preserve">ome studies have concluded </w:t>
-      </w:r>
-      <w:r>
-        <w:rPr/>
-        <w:lastRenderedPageBreak/>
-        <w:t>that stability to digestion and allergenicity are not related (</w:t>
-      </w:r>
-      <w:r>
-        <w:rPr/>
-        <w:t>Fu et al., 2002; Herman et al.,</w:t>
-      </w:r>
-      <w:r>
-        <w:rPr/>
-        <w:t xml:space="preserve"> </w:t>
-      </w:r>
-      <w:r>
-        <w:rPr/>
-        <w:t>2007; Bogh and Madsen, 2015)</w:t>
-      </w:r>
-      <w:r>
-        <w:rPr/>
-        <w:t>, and allergenicity and toxicity assessment based on history of safe use, mode of action and bioinformatics, without digestibility studies</w:t>
-      </w:r>
-      <w:r>
-        <w:rPr/>
-        <w:t>,</w:t>
-      </w:r>
-      <w:r>
-        <w:rPr/>
-        <w:t xml:space="preserve"> may be sufficient to demonstrate safety of newly expressed proteins in GE crops (Brune et al</w:t>
-      </w:r>
-      <w:r>
-        <w:rPr/>
-        <w:t xml:space="preserve">. </w:t>
-      </w:r>
-      <w:r>
-        <w:rPr/>
-        <w:t>2021)</w:t>
-      </w:r>
-      <w:r>
-        <w:rPr/>
-        <w:t>.</w:t>
-      </w:r>
-      <w:r>
-        <w:rPr/>
-        <w:t xml:space="preserve"> </w:t>
-      </w:r>
-    </w:p>
-    <w:p>
-      <w:pPr>
-        <w:autoSpaceDE w:val="0"/>
-        <w:autoSpaceDN w:val="0"/>
-        <w:adjustRightInd w:val="0"/>
-        <w:spacing w:line="276" w:lineRule="auto"/>
-      </w:pPr>
-    </w:p>
-    <w:p>
-      <w:pPr>
-        <w:autoSpaceDE w:val="0"/>
-        <w:autoSpaceDN w:val="0"/>
-        <w:adjustRightInd w:val="0"/>
-        <w:spacing w:line="276" w:lineRule="auto"/>
-      </w:pPr>
-      <w:r>
-        <w:rPr/>
         <w:t>A standard protocol</w:t>
       </w:r>
       <w:r>
@@ -40746,6 +40776,7 @@
     </w:p>
     <w:p>
       <w:pPr>
+        <w:pStyle w:val="Head_CropName"/>
         <w:spacing w:before="240" w:after="240" w:line="276" w:lineRule="auto"/>
       </w:pPr>
       <w:r>
@@ -40946,6 +40977,7 @@
     </w:p>
     <w:p>
       <w:pPr>
+        <w:pStyle w:val="Head_CropName"/>
         <w:spacing w:before="240" w:after="240" w:line="276" w:lineRule="auto"/>
       </w:pPr>
       <w:r>
@@ -41176,6 +41208,7 @@
     </w:p>
     <w:p>
       <w:pPr>
+        <w:pStyle w:val="Head_CropName"/>
         <w:spacing w:before="240" w:after="240" w:line="276" w:lineRule="auto"/>
       </w:pPr>
       <w:r>
@@ -41275,6 +41308,7 @@
     </w:p>
     <w:p>
       <w:pPr>
+        <w:pStyle w:val="Head_CropName"/>
         <w:spacing w:before="240" w:after="240" w:line="276" w:lineRule="auto"/>
       </w:pPr>
       <w:r>
@@ -41399,6 +41433,7 @@
     </w:p>
     <w:p>
       <w:pPr>
+        <w:pStyle w:val="Head_CropName"/>
         <w:spacing w:before="240" w:after="240" w:line="276" w:lineRule="auto"/>
       </w:pPr>
       <w:r>
@@ -41561,6 +41596,7 @@
     </w:p>
     <w:p>
       <w:pPr>
+        <w:pStyle w:val="Head_Section"/>
         <w:spacing w:before="240" w:after="240"/>
       </w:pPr>
       <w:r>
@@ -42414,6 +42450,7 @@
     </w:p>
     <w:p>
       <w:pPr>
+        <w:pStyle w:val="Head_Section"/>
         <w:spacing w:before="240" w:after="240" w:line="276" w:lineRule="auto"/>
       </w:pPr>
       <w:r>
@@ -47136,6 +47173,26 @@
       <w:shd w:val="clear" w:color="auto" w:fill="E1DFDD"/>
     </w:rPr>
   </w:style>
+  <w:style w:type="paragraph" w:customStyle="1" w:styleId="Head_CropName">
+    <w:name w:val="Head_CropName"/>
+    <w:basedOn w:val="Normal"/>
+  </w:style>
+  <w:style w:type="paragraph" w:customStyle="1" w:styleId="Head_Section">
+    <w:name w:val="Head_Section"/>
+    <w:basedOn w:val="Normal"/>
+  </w:style>
+  <w:style w:type="paragraph" w:customStyle="1" w:styleId="Head_SubsectionUnnumbered">
+    <w:name w:val="Head_SubsectionUnnumbered"/>
+    <w:basedOn w:val="Normal"/>
+  </w:style>
+  <w:style w:type="paragraph" w:customStyle="1" w:styleId="Table_FootNote">
+    <w:name w:val="Table_FootNote"/>
+    <w:basedOn w:val="Normal"/>
+  </w:style>
+  <w:style w:type="paragraph" w:customStyle="1" w:styleId="Table_Header">
+    <w:name w:val="Table_Header"/>
+    <w:basedOn w:val="Normal"/>
+  </w:style>
 </w:styles>
 </file>
 

</xml_diff>

<commit_message>
Add handoff notes features 1, 2, 6 and regenerate clean docx
- TitleCaseHeadings.jsx: add Title_Title to stylesToFix array
- TableStyler.jsx: increase rotated header height multiplier 0.50 → 0.58
- clean_docx.py: fix Table_Header → Table_Heading (4 occurrences)
- Regenerate Cry1Ab_FFS_original_clean.docx and _footnotes.docx
- Add README.md and deprecated_scripts/ from March 13 session

Co-Authored-By: Claude Sonnet 4.6 <noreply@anthropic.com>
</commit_message>
<xml_diff>
--- a/docs/Cry1Ab_FFS_original_clean.docx
+++ b/docs/Cry1Ab_FFS_original_clean.docx
@@ -1311,7 +1311,7 @@
     </w:p>
     <w:p>
       <w:pPr>
-        <w:pStyle w:val="Table_Header"/>
+        <w:pStyle w:val="Table_Heading"/>
       </w:pPr>
       <w:r>
         <w:t>Table 1. Cry1Ab expressing maize single transformation events with food safety approvals up to 2010.</w:t>
@@ -4820,7 +4820,7 @@
     </w:p>
     <w:p>
       <w:pPr>
-        <w:pStyle w:val="Table_Header"/>
+        <w:pStyle w:val="Table_Heading"/>
       </w:pPr>
       <w:r>
         <w:rPr/>
@@ -6370,7 +6370,7 @@
     </w:p>
     <w:p>
       <w:pPr>
-        <w:pStyle w:val="Table_Header"/>
+        <w:pStyle w:val="Table_Heading"/>
       </w:pPr>
       <w:r>
         <w:t>Table 3. Cry1Ab expressing maize event MON810 breeding stacks with food safety approvals. Approvals after 2020 are highlighted.</w:t>
@@ -14616,7 +14616,7 @@
     </w:p>
     <w:p>
       <w:pPr>
-        <w:pStyle w:val="Table_Header"/>
+        <w:pStyle w:val="Table_Heading"/>
       </w:pPr>
       <w:r>
         <w:t>Table 4. Cry1Ab expressing maize event Bt11 breeding stacks with food safety approvals. Approvals after 2020 are highlighted.</w:t>
@@ -25985,7 +25985,7 @@
     </w:p>
     <w:p>
       <w:pPr>
-        <w:pStyle w:val="Table_Header"/>
+        <w:pStyle w:val="Table_Heading"/>
       </w:pPr>
       <w:r>
         <w:rPr/>
@@ -31043,7 +31043,7 @@
     </w:p>
     <w:p>
       <w:pPr>
-        <w:pStyle w:val="Table_Header"/>
+        <w:pStyle w:val="Table_Heading"/>
         <w:spacing w:line="276" w:lineRule="auto"/>
       </w:pPr>
       <w:r>
@@ -33620,7 +33620,7 @@
     </w:p>
     <w:p>
       <w:pPr>
-        <w:pStyle w:val="Table_Header"/>
+        <w:pStyle w:val="Table_Heading"/>
         <w:spacing w:before="240" w:after="240"/>
       </w:pPr>
       <w:r>
@@ -35498,7 +35498,7 @@
     </w:p>
     <w:p>
       <w:pPr>
-        <w:pStyle w:val="Table_Header"/>
+        <w:pStyle w:val="Table_Heading"/>
         <w:spacing w:before="177" w:line="249" w:lineRule="auto"/>
         <w:jc w:val="both"/>
       </w:pPr>
@@ -47189,8 +47189,8 @@
     <w:name w:val="Table_FootNote"/>
     <w:basedOn w:val="Normal"/>
   </w:style>
-  <w:style w:type="paragraph" w:customStyle="1" w:styleId="Table_Header">
-    <w:name w:val="Table_Header"/>
+  <w:style w:type="paragraph" w:customStyle="1" w:styleId="Table_Heading">
+    <w:name w:val="Table_Heading"/>
     <w:basedOn w:val="Normal"/>
   </w:style>
 </w:styles>

</xml_diff>

<commit_message>
Fix repeat-reference fake footnotes; add handoff notes and restart prompt
- clean_docx.py: when customMarkFollows="1" and the referenced footnote
  body is empty, emit {{mark_text}} (plain superscript) instead of
  {{fn:N}} — repeat references now become superscripted numbers via
  CleanUp.jsx rather than unmatched red markers in InDesign
- README.md: document repeat-reference behaviour; fix Yes/No button
  label for FindDeleteEmptyFootnotes
- Add HANDOFF_NOTES.md covering all changes made across this session
- Add RESTART_PROMPT.txt for quick context reload in future sessions

Co-Authored-By: Claude Sonnet 4.6 <noreply@anthropic.com>
</commit_message>
<xml_diff>
--- a/docs/Cry1Ab_FFS_original_clean.docx
+++ b/docs/Cry1Ab_FFS_original_clean.docx
@@ -6310,8 +6310,7 @@
       </w:r>
       <w:r>
         <w:rPr/>
-        <w:t>4</w:t>
-        <w:t>{{fn:5}}</w:t>
+        <w:t>{{4}}</w:t>
       </w:r>
       <w:r>
         <w:rPr/>
@@ -6331,8 +6330,7 @@
       </w:r>
       <w:r>
         <w:rPr/>
-        <w:t>4</w:t>
-        <w:t>{{fn:6}}</w:t>
+        <w:t>{{4}}</w:t>
       </w:r>
       <w:r>
         <w:rPr/>

</xml_diff>